<commit_message>
Report restyled to plain business format
</commit_message>
<xml_diff>
--- a/docs/프로젝트_진행보고서_2026-10-03.docx
+++ b/docs/프로젝트_진행보고서_2026-10-03.docx
@@ -4,98 +4,196 @@
   <w:body>
     <w:p>
       <w:pPr>
-        <w:spacing w:after="1200"/>
-      </w:pPr>
-    </w:p>
-    <w:p>
-      <w:pPr>
-        <w:spacing w:after="200"/>
+        <w:spacing w:after="280"/>
         <w:jc w:val="center"/>
       </w:pPr>
       <w:r>
         <w:rPr>
           <w:b/>
           <w:i w:val="0"/>
-          <w:color w:val="1F3A5F"/>
-          <w:sz w:val="48"/>
+          <w:sz w:val="36"/>
         </w:rPr>
-        <w:t>AI 기반 파각 검출 및 검란 기능 개발</w:t>
+        <w:t>AI 기반 파각 검출 및 검란 기능 개발 진행 보고서</w:t>
       </w:r>
     </w:p>
+    <w:tbl>
+      <w:tblPr>
+        <w:tblStyle w:val="TableGrid"/>
+        <w:tblW w:type="auto" w:w="0"/>
+        <w:jc w:val="center"/>
+        <w:tblLook w:firstColumn="1" w:firstRow="1" w:lastColumn="0" w:lastRow="0" w:noHBand="0" w:noVBand="1" w:val="04A0"/>
+      </w:tblPr>
+      <w:tblGrid>
+        <w:gridCol w:w="4819"/>
+        <w:gridCol w:w="4819"/>
+      </w:tblGrid>
+      <w:tr>
+        <w:tc>
+          <w:tcPr>
+            <w:tcW w:type="dxa" w:w="1701"/>
+            <w:shd w:val="clear" w:color="auto" w:fill="F2F2F2"/>
+          </w:tcPr>
+          <w:p>
+            <w:r/>
+            <w:r>
+              <w:rPr>
+                <w:b/>
+                <w:sz w:val="20"/>
+              </w:rPr>
+              <w:t>문서명</w:t>
+            </w:r>
+          </w:p>
+        </w:tc>
+        <w:tc>
+          <w:tcPr>
+            <w:tcW w:type="dxa" w:w="7937"/>
+            <w:shd w:val="clear" w:color="auto" w:fill="F2F2F2"/>
+          </w:tcPr>
+          <w:p>
+            <w:r/>
+            <w:r>
+              <w:rPr>
+                <w:b/>
+                <w:sz w:val="20"/>
+              </w:rPr>
+              <w:t>AI 기반 파각 검출 및 검란 기능 개발 진행 보고서 (Phase 1~7)</w:t>
+            </w:r>
+          </w:p>
+        </w:tc>
+      </w:tr>
+      <w:tr>
+        <w:tc>
+          <w:tcPr>
+            <w:tcW w:type="dxa" w:w="1701"/>
+          </w:tcPr>
+          <w:p>
+            <w:r/>
+            <w:r>
+              <w:rPr>
+                <w:b w:val="0"/>
+                <w:sz w:val="20"/>
+              </w:rPr>
+              <w:t>작성일</w:t>
+            </w:r>
+          </w:p>
+        </w:tc>
+        <w:tc>
+          <w:tcPr>
+            <w:tcW w:type="dxa" w:w="7937"/>
+          </w:tcPr>
+          <w:p>
+            <w:r/>
+            <w:r>
+              <w:rPr>
+                <w:b w:val="0"/>
+                <w:sz w:val="20"/>
+              </w:rPr>
+              <w:t>2026년 10월 3일</w:t>
+            </w:r>
+          </w:p>
+        </w:tc>
+      </w:tr>
+      <w:tr>
+        <w:tc>
+          <w:tcPr>
+            <w:tcW w:type="dxa" w:w="1701"/>
+          </w:tcPr>
+          <w:p>
+            <w:r/>
+            <w:r>
+              <w:rPr>
+                <w:b w:val="0"/>
+                <w:sz w:val="20"/>
+              </w:rPr>
+              <w:t>작업 기간</w:t>
+            </w:r>
+          </w:p>
+        </w:tc>
+        <w:tc>
+          <w:tcPr>
+            <w:tcW w:type="dxa" w:w="7937"/>
+          </w:tcPr>
+          <w:p>
+            <w:r/>
+            <w:r>
+              <w:rPr>
+                <w:b w:val="0"/>
+                <w:sz w:val="20"/>
+              </w:rPr>
+              <w:t>2026년 9월 23일 ~ 9월 26일</w:t>
+            </w:r>
+          </w:p>
+        </w:tc>
+      </w:tr>
+      <w:tr>
+        <w:tc>
+          <w:tcPr>
+            <w:tcW w:type="dxa" w:w="1701"/>
+          </w:tcPr>
+          <w:p>
+            <w:r/>
+            <w:r>
+              <w:rPr>
+                <w:b w:val="0"/>
+                <w:sz w:val="20"/>
+              </w:rPr>
+              <w:t>작성자</w:t>
+            </w:r>
+          </w:p>
+        </w:tc>
+        <w:tc>
+          <w:tcPr>
+            <w:tcW w:type="dxa" w:w="7937"/>
+          </w:tcPr>
+          <w:p>
+            <w:r/>
+            <w:r>
+              <w:rPr>
+                <w:b w:val="0"/>
+                <w:sz w:val="20"/>
+              </w:rPr>
+              <w:t xml:space="preserve">                                   (기입)</w:t>
+            </w:r>
+          </w:p>
+        </w:tc>
+      </w:tr>
+      <w:tr>
+        <w:tc>
+          <w:tcPr>
+            <w:tcW w:type="dxa" w:w="1701"/>
+          </w:tcPr>
+          <w:p>
+            <w:r/>
+            <w:r>
+              <w:rPr>
+                <w:b w:val="0"/>
+                <w:sz w:val="20"/>
+              </w:rPr>
+              <w:t>배포</w:t>
+            </w:r>
+          </w:p>
+        </w:tc>
+        <w:tc>
+          <w:tcPr>
+            <w:tcW w:type="dxa" w:w="7937"/>
+          </w:tcPr>
+          <w:p>
+            <w:r/>
+            <w:r>
+              <w:rPr>
+                <w:b w:val="0"/>
+                <w:sz w:val="20"/>
+              </w:rPr>
+              <w:t>이데아아이(주) 내부 검토용</w:t>
+            </w:r>
+          </w:p>
+        </w:tc>
+      </w:tr>
+    </w:tbl>
     <w:p>
       <w:pPr>
-        <w:spacing w:after="600"/>
-        <w:jc w:val="center"/>
+        <w:spacing w:after="40"/>
       </w:pPr>
-      <w:r>
-        <w:rPr>
-          <w:b w:val="0"/>
-          <w:i w:val="0"/>
-          <w:sz w:val="32"/>
-        </w:rPr>
-        <w:t>진행 보고서 (Phase 1 ~ 7)</w:t>
-      </w:r>
-    </w:p>
-    <w:p>
-      <w:pPr>
-        <w:spacing w:after="80"/>
-        <w:jc w:val="center"/>
-      </w:pPr>
-      <w:r>
-        <w:rPr>
-          <w:b w:val="0"/>
-          <w:i w:val="0"/>
-          <w:sz w:val="26"/>
-        </w:rPr>
-        <w:t>이데아아이(주)</w:t>
-      </w:r>
-    </w:p>
-    <w:p>
-      <w:pPr>
-        <w:spacing w:after="80"/>
-        <w:jc w:val="center"/>
-      </w:pPr>
-      <w:r>
-        <w:rPr>
-          <w:b w:val="0"/>
-          <w:i w:val="0"/>
-          <w:sz w:val="22"/>
-        </w:rPr>
-        <w:t>작업 기간: 2026-09-23 ~ 2026-09-26   |   작성일: 2026-10-03</w:t>
-      </w:r>
-    </w:p>
-    <w:p>
-      <w:pPr>
-        <w:spacing w:after="800"/>
-        <w:jc w:val="center"/>
-      </w:pPr>
-      <w:r>
-        <w:rPr>
-          <w:b w:val="0"/>
-          <w:i w:val="0"/>
-          <w:sz w:val="20"/>
-        </w:rPr>
-        <w:t>작성: Claude Code (자동 실험 파이프라인) · 검토: 프로젝트 담당자</w:t>
-      </w:r>
-    </w:p>
-    <w:p>
-      <w:pPr>
-        <w:spacing w:after="120"/>
-        <w:jc w:val="center"/>
-      </w:pPr>
-      <w:r>
-        <w:rPr>
-          <w:b w:val="0"/>
-          <w:i/>
-          <w:sz w:val="19"/>
-        </w:rPr>
-        <w:t>본 보고서의 모든 수치는 AI Hub 「계란 데이터」(다운로드본, 공식의 90%) 내부 test 분할 기준이며, 클래스명은 공식 코드표 확인 전의 가설입니다(혈반육반·거품·먹통은 육안 확인). 자사 라인 데이터 평가는 데이터 입고 후 수행 예정입니다.</w:t>
-      </w:r>
-    </w:p>
-    <w:p>
-      <w:r>
-        <w:br w:type="page"/>
-      </w:r>
     </w:p>
     <w:p>
       <w:pPr>
@@ -114,7 +212,7 @@
           <w:b w:val="0"/>
           <w:i w:val="0"/>
         </w:rPr>
-        <w:t>공개 데이터(AI Hub 계란 데이터 137,117판 / 1,242,967개 계란 라벨)로 파각 검출과 검란 모델을 개발하고, 엣지 배포를 위한 추론 파이프라인까지 구축했습니다. 핵심 결론은 다음과 같습니다.</w:t>
+        <w:t>공개 데이터(AI Hub 계란 데이터 137,117판 / 1,242,967개 계란 라벨)로 파각 검출과 검란 모델을 개발하고, 엣지 배포를 위한 추론 파이프라인까지 구축했습니다. 주요 결과는 다음과 같습니다.</w:t>
       </w:r>
     </w:p>
     <w:p>
@@ -253,7 +351,7 @@
         <w:tc>
           <w:tcPr>
             <w:tcW w:type="dxa" w:w="1984"/>
-            <w:shd w:val="clear" w:color="auto" w:fill="DCE6F1"/>
+            <w:shd w:val="clear" w:color="auto" w:fill="F2F2F2"/>
           </w:tcPr>
           <w:p>
             <w:r/>
@@ -269,7 +367,7 @@
         <w:tc>
           <w:tcPr>
             <w:tcW w:type="dxa" w:w="7654"/>
-            <w:shd w:val="clear" w:color="auto" w:fill="DCE6F1"/>
+            <w:shd w:val="clear" w:color="auto" w:fill="F2F2F2"/>
           </w:tcPr>
           <w:p>
             <w:r/>
@@ -441,7 +539,7 @@
         <w:tc>
           <w:tcPr>
             <w:tcW w:type="dxa" w:w="2551"/>
-            <w:shd w:val="clear" w:color="auto" w:fill="DCE6F1"/>
+            <w:shd w:val="clear" w:color="auto" w:fill="F2F2F2"/>
           </w:tcPr>
           <w:p>
             <w:r/>
@@ -457,7 +555,7 @@
         <w:tc>
           <w:tcPr>
             <w:tcW w:type="dxa" w:w="4252"/>
-            <w:shd w:val="clear" w:color="auto" w:fill="DCE6F1"/>
+            <w:shd w:val="clear" w:color="auto" w:fill="F2F2F2"/>
           </w:tcPr>
           <w:p>
             <w:r/>
@@ -473,7 +571,7 @@
         <w:tc>
           <w:tcPr>
             <w:tcW w:type="dxa" w:w="2835"/>
-            <w:shd w:val="clear" w:color="auto" w:fill="DCE6F1"/>
+            <w:shd w:val="clear" w:color="auto" w:fill="F2F2F2"/>
           </w:tcPr>
           <w:p>
             <w:r/>
@@ -765,7 +863,7 @@
         <w:tc>
           <w:tcPr>
             <w:tcW w:type="dxa" w:w="2041"/>
-            <w:shd w:val="clear" w:color="auto" w:fill="DCE6F1"/>
+            <w:shd w:val="clear" w:color="auto" w:fill="F2F2F2"/>
           </w:tcPr>
           <w:p>
             <w:r/>
@@ -781,7 +879,7 @@
         <w:tc>
           <w:tcPr>
             <w:tcW w:type="dxa" w:w="2041"/>
-            <w:shd w:val="clear" w:color="auto" w:fill="DCE6F1"/>
+            <w:shd w:val="clear" w:color="auto" w:fill="F2F2F2"/>
           </w:tcPr>
           <w:p>
             <w:r/>
@@ -797,7 +895,7 @@
         <w:tc>
           <w:tcPr>
             <w:tcW w:type="dxa" w:w="3742"/>
-            <w:shd w:val="clear" w:color="auto" w:fill="DCE6F1"/>
+            <w:shd w:val="clear" w:color="auto" w:fill="F2F2F2"/>
           </w:tcPr>
           <w:p>
             <w:r/>
@@ -813,7 +911,7 @@
         <w:tc>
           <w:tcPr>
             <w:tcW w:type="dxa" w:w="1814"/>
-            <w:shd w:val="clear" w:color="auto" w:fill="DCE6F1"/>
+            <w:shd w:val="clear" w:color="auto" w:fill="F2F2F2"/>
           </w:tcPr>
           <w:p>
             <w:r/>
@@ -1119,7 +1217,7 @@
         <w:tc>
           <w:tcPr>
             <w:tcW w:type="dxa" w:w="3515"/>
-            <w:shd w:val="clear" w:color="auto" w:fill="DCE6F1"/>
+            <w:shd w:val="clear" w:color="auto" w:fill="F2F2F2"/>
           </w:tcPr>
           <w:p>
             <w:r/>
@@ -1135,7 +1233,7 @@
         <w:tc>
           <w:tcPr>
             <w:tcW w:type="dxa" w:w="1247"/>
-            <w:shd w:val="clear" w:color="auto" w:fill="DCE6F1"/>
+            <w:shd w:val="clear" w:color="auto" w:fill="F2F2F2"/>
           </w:tcPr>
           <w:p>
             <w:r/>
@@ -1151,7 +1249,7 @@
         <w:tc>
           <w:tcPr>
             <w:tcW w:type="dxa" w:w="1247"/>
-            <w:shd w:val="clear" w:color="auto" w:fill="DCE6F1"/>
+            <w:shd w:val="clear" w:color="auto" w:fill="F2F2F2"/>
           </w:tcPr>
           <w:p>
             <w:r/>
@@ -1167,7 +1265,7 @@
         <w:tc>
           <w:tcPr>
             <w:tcW w:type="dxa" w:w="1247"/>
-            <w:shd w:val="clear" w:color="auto" w:fill="DCE6F1"/>
+            <w:shd w:val="clear" w:color="auto" w:fill="F2F2F2"/>
           </w:tcPr>
           <w:p>
             <w:r/>
@@ -1183,7 +1281,7 @@
         <w:tc>
           <w:tcPr>
             <w:tcW w:type="dxa" w:w="2381"/>
-            <w:shd w:val="clear" w:color="auto" w:fill="DCE6F1"/>
+            <w:shd w:val="clear" w:color="auto" w:fill="F2F2F2"/>
           </w:tcPr>
           <w:p>
             <w:r/>
@@ -2051,7 +2149,7 @@
         <w:tc>
           <w:tcPr>
             <w:tcW w:type="dxa" w:w="2835"/>
-            <w:shd w:val="clear" w:color="auto" w:fill="DCE6F1"/>
+            <w:shd w:val="clear" w:color="auto" w:fill="F2F2F2"/>
           </w:tcPr>
           <w:p>
             <w:r/>
@@ -2067,7 +2165,7 @@
         <w:tc>
           <w:tcPr>
             <w:tcW w:type="dxa" w:w="1474"/>
-            <w:shd w:val="clear" w:color="auto" w:fill="DCE6F1"/>
+            <w:shd w:val="clear" w:color="auto" w:fill="F2F2F2"/>
           </w:tcPr>
           <w:p>
             <w:r/>
@@ -2083,7 +2181,7 @@
         <w:tc>
           <w:tcPr>
             <w:tcW w:type="dxa" w:w="1247"/>
-            <w:shd w:val="clear" w:color="auto" w:fill="DCE6F1"/>
+            <w:shd w:val="clear" w:color="auto" w:fill="F2F2F2"/>
           </w:tcPr>
           <w:p>
             <w:r/>
@@ -2099,7 +2197,7 @@
         <w:tc>
           <w:tcPr>
             <w:tcW w:type="dxa" w:w="1587"/>
-            <w:shd w:val="clear" w:color="auto" w:fill="DCE6F1"/>
+            <w:shd w:val="clear" w:color="auto" w:fill="F2F2F2"/>
           </w:tcPr>
           <w:p>
             <w:r/>
@@ -2115,7 +2213,7 @@
         <w:tc>
           <w:tcPr>
             <w:tcW w:type="dxa" w:w="2494"/>
-            <w:shd w:val="clear" w:color="auto" w:fill="DCE6F1"/>
+            <w:shd w:val="clear" w:color="auto" w:fill="F2F2F2"/>
           </w:tcPr>
           <w:p>
             <w:r/>
@@ -2443,7 +2541,7 @@
         <w:tc>
           <w:tcPr>
             <w:tcW w:type="dxa" w:w="3969"/>
-            <w:shd w:val="clear" w:color="auto" w:fill="DCE6F1"/>
+            <w:shd w:val="clear" w:color="auto" w:fill="F2F2F2"/>
           </w:tcPr>
           <w:p>
             <w:r/>
@@ -2459,7 +2557,7 @@
         <w:tc>
           <w:tcPr>
             <w:tcW w:type="dxa" w:w="1871"/>
-            <w:shd w:val="clear" w:color="auto" w:fill="DCE6F1"/>
+            <w:shd w:val="clear" w:color="auto" w:fill="F2F2F2"/>
           </w:tcPr>
           <w:p>
             <w:r/>
@@ -2475,7 +2573,7 @@
         <w:tc>
           <w:tcPr>
             <w:tcW w:type="dxa" w:w="1871"/>
-            <w:shd w:val="clear" w:color="auto" w:fill="DCE6F1"/>
+            <w:shd w:val="clear" w:color="auto" w:fill="F2F2F2"/>
           </w:tcPr>
           <w:p>
             <w:r/>
@@ -2491,7 +2589,7 @@
         <w:tc>
           <w:tcPr>
             <w:tcW w:type="dxa" w:w="1928"/>
-            <w:shd w:val="clear" w:color="auto" w:fill="DCE6F1"/>
+            <w:shd w:val="clear" w:color="auto" w:fill="F2F2F2"/>
           </w:tcPr>
           <w:p>
             <w:r/>
@@ -2780,7 +2878,7 @@
         <w:tc>
           <w:tcPr>
             <w:tcW w:type="dxa" w:w="1984"/>
-            <w:shd w:val="clear" w:color="auto" w:fill="DCE6F1"/>
+            <w:shd w:val="clear" w:color="auto" w:fill="F2F2F2"/>
           </w:tcPr>
           <w:p>
             <w:r/>
@@ -2796,7 +2894,7 @@
         <w:tc>
           <w:tcPr>
             <w:tcW w:type="dxa" w:w="7654"/>
-            <w:shd w:val="clear" w:color="auto" w:fill="DCE6F1"/>
+            <w:shd w:val="clear" w:color="auto" w:fill="F2F2F2"/>
           </w:tcPr>
           <w:p>
             <w:r/>
@@ -3001,7 +3099,7 @@
         <w:tc>
           <w:tcPr>
             <w:tcW w:type="dxa" w:w="4535"/>
-            <w:shd w:val="clear" w:color="auto" w:fill="DCE6F1"/>
+            <w:shd w:val="clear" w:color="auto" w:fill="F2F2F2"/>
           </w:tcPr>
           <w:p>
             <w:r/>
@@ -3017,7 +3115,7 @@
         <w:tc>
           <w:tcPr>
             <w:tcW w:type="dxa" w:w="1701"/>
-            <w:shd w:val="clear" w:color="auto" w:fill="DCE6F1"/>
+            <w:shd w:val="clear" w:color="auto" w:fill="F2F2F2"/>
           </w:tcPr>
           <w:p>
             <w:r/>
@@ -3033,7 +3131,7 @@
         <w:tc>
           <w:tcPr>
             <w:tcW w:type="dxa" w:w="1701"/>
-            <w:shd w:val="clear" w:color="auto" w:fill="DCE6F1"/>
+            <w:shd w:val="clear" w:color="auto" w:fill="F2F2F2"/>
           </w:tcPr>
           <w:p>
             <w:r/>
@@ -3049,7 +3147,7 @@
         <w:tc>
           <w:tcPr>
             <w:tcW w:type="dxa" w:w="1701"/>
-            <w:shd w:val="clear" w:color="auto" w:fill="DCE6F1"/>
+            <w:shd w:val="clear" w:color="auto" w:fill="F2F2F2"/>
           </w:tcPr>
           <w:p>
             <w:r/>
@@ -3496,7 +3594,7 @@
         <w:tc>
           <w:tcPr>
             <w:tcW w:type="dxa" w:w="1928"/>
-            <w:shd w:val="clear" w:color="auto" w:fill="DCE6F1"/>
+            <w:shd w:val="clear" w:color="auto" w:fill="F2F2F2"/>
           </w:tcPr>
           <w:p>
             <w:r/>
@@ -3512,7 +3610,7 @@
         <w:tc>
           <w:tcPr>
             <w:tcW w:type="dxa" w:w="3742"/>
-            <w:shd w:val="clear" w:color="auto" w:fill="DCE6F1"/>
+            <w:shd w:val="clear" w:color="auto" w:fill="F2F2F2"/>
           </w:tcPr>
           <w:p>
             <w:r/>
@@ -3528,7 +3626,7 @@
         <w:tc>
           <w:tcPr>
             <w:tcW w:type="dxa" w:w="3969"/>
-            <w:shd w:val="clear" w:color="auto" w:fill="DCE6F1"/>
+            <w:shd w:val="clear" w:color="auto" w:fill="F2F2F2"/>
           </w:tcPr>
           <w:p>
             <w:r/>
@@ -3898,7 +3996,7 @@
         <w:tc>
           <w:tcPr>
             <w:tcW w:type="dxa" w:w="1474"/>
-            <w:shd w:val="clear" w:color="auto" w:fill="DCE6F1"/>
+            <w:shd w:val="clear" w:color="auto" w:fill="F2F2F2"/>
           </w:tcPr>
           <w:p>
             <w:r/>
@@ -3914,7 +4012,7 @@
         <w:tc>
           <w:tcPr>
             <w:tcW w:type="dxa" w:w="3402"/>
-            <w:shd w:val="clear" w:color="auto" w:fill="DCE6F1"/>
+            <w:shd w:val="clear" w:color="auto" w:fill="F2F2F2"/>
           </w:tcPr>
           <w:p>
             <w:r/>
@@ -3930,7 +4028,7 @@
         <w:tc>
           <w:tcPr>
             <w:tcW w:type="dxa" w:w="4762"/>
-            <w:shd w:val="clear" w:color="auto" w:fill="DCE6F1"/>
+            <w:shd w:val="clear" w:color="auto" w:fill="F2F2F2"/>
           </w:tcPr>
           <w:p>
             <w:r/>
@@ -4292,16 +4390,37 @@
     </w:p>
     <w:p>
       <w:pPr>
-        <w:spacing w:after="120"/>
-        <w:jc w:val="center"/>
+        <w:pStyle w:val="Heading1"/>
       </w:pPr>
       <w:r>
-        <w:rPr>
-          <w:b w:val="0"/>
-          <w:i w:val="0"/>
-          <w:color w:val="808080"/>
-        </w:rPr>
-        <w:t>— 끝 —</w:t>
+        <w:t>8. 참고 사항</w:t>
+      </w:r>
+    </w:p>
+    <w:p>
+      <w:pPr>
+        <w:pStyle w:val="ListBullet"/>
+        <w:spacing w:after="60"/>
+      </w:pPr>
+      <w:r>
+        <w:t>본 보고서의 수치는 AI Hub 「계란 데이터」(다운로드본, 공식 데이터의 90%)의 내부 test 분할 기준이며, 공식 비공개 test와는 조건이 다릅니다.</w:t>
+      </w:r>
+    </w:p>
+    <w:p>
+      <w:pPr>
+        <w:pStyle w:val="ListBullet"/>
+        <w:spacing w:after="60"/>
+      </w:pPr>
+      <w:r>
+        <w:t>클래스명은 공식 코드표 확인 전의 추정값입니다(혈반육반·거품·먹통은 육안 확인 완료). 코드표 확인 후 명칭이 바뀔 수 있습니다.</w:t>
+      </w:r>
+    </w:p>
+    <w:p>
+      <w:pPr>
+        <w:pStyle w:val="ListBullet"/>
+        <w:spacing w:after="60"/>
+      </w:pPr>
+      <w:r>
+        <w:t>자사 라인 데이터에 대한 평가는 데이터 입고 후 수행 예정이며, 본 보고서의 성능은 공개 데이터 기준입니다.</w:t>
       </w:r>
     </w:p>
     <w:sectPr>
@@ -4744,8 +4863,8 @@
       <w:rFonts w:asciiTheme="majorHAnsi" w:eastAsiaTheme="majorEastAsia" w:hAnsiTheme="majorHAnsi" w:cstheme="majorBidi" w:ascii="Malgun Gothic" w:hAnsi="Malgun Gothic" w:eastAsia="Malgun Gothic"/>
       <w:b/>
       <w:bCs/>
-      <w:color w:val="1F3A5F"/>
-      <w:sz w:val="32"/>
+      <w:color w:val="000000"/>
+      <w:sz w:val="28"/>
       <w:szCs w:val="28"/>
     </w:rPr>
   </w:style>
@@ -4768,8 +4887,8 @@
       <w:rFonts w:asciiTheme="majorHAnsi" w:eastAsiaTheme="majorEastAsia" w:hAnsiTheme="majorHAnsi" w:cstheme="majorBidi" w:ascii="Malgun Gothic" w:hAnsi="Malgun Gothic" w:eastAsia="Malgun Gothic"/>
       <w:b/>
       <w:bCs/>
-      <w:color w:val="1F3A5F"/>
-      <w:sz w:val="26"/>
+      <w:color w:val="000000"/>
+      <w:sz w:val="24"/>
       <w:szCs w:val="26"/>
     </w:rPr>
   </w:style>
@@ -4792,7 +4911,7 @@
       <w:rFonts w:asciiTheme="majorHAnsi" w:eastAsiaTheme="majorEastAsia" w:hAnsiTheme="majorHAnsi" w:cstheme="majorBidi" w:ascii="Malgun Gothic" w:hAnsi="Malgun Gothic" w:eastAsia="Malgun Gothic"/>
       <w:b/>
       <w:bCs/>
-      <w:color w:val="1F3A5F"/>
+      <w:color w:val="000000"/>
     </w:rPr>
   </w:style>
   <w:style w:type="paragraph" w:styleId="Heading4">
@@ -5031,7 +5150,7 @@
     </w:pPr>
     <w:rPr>
       <w:rFonts w:asciiTheme="majorHAnsi" w:eastAsiaTheme="majorEastAsia" w:hAnsiTheme="majorHAnsi" w:cstheme="majorBidi" w:ascii="Malgun Gothic" w:hAnsi="Malgun Gothic" w:eastAsia="Malgun Gothic"/>
-      <w:color w:val="1F3A5F"/>
+      <w:color w:val="000000"/>
       <w:spacing w:val="5"/>
       <w:kern w:val="28"/>
       <w:sz w:val="44"/>

</xml_diff>